<commit_message>
esta es una actualizacion 21-08-25
</commit_message>
<xml_diff>
--- a/impuesto predial y presupuesto- articulo.docx
+++ b/impuesto predial y presupuesto- articulo.docx
@@ -762,6 +762,139 @@
       <w:pPr>
         <w:rPr>
           <w:rFonts w:ascii="Times New Roman" w:hAnsi="Times New Roman" w:cs="Times New Roman"/>
+        </w:rPr>
+      </w:pPr>
+    </w:p>
+    <w:p>
+      <w:pPr>
+        <w:rPr>
+          <w:rFonts w:ascii="Times New Roman" w:hAnsi="Times New Roman" w:cs="Times New Roman"/>
+        </w:rPr>
+      </w:pPr>
+    </w:p>
+    <w:p>
+      <w:pPr>
+        <w:rPr>
+          <w:rFonts w:ascii="Times New Roman" w:hAnsi="Times New Roman" w:cs="Times New Roman"/>
+        </w:rPr>
+      </w:pPr>
+    </w:p>
+    <w:p>
+      <w:pPr>
+        <w:rPr>
+          <w:rFonts w:ascii="Times New Roman" w:hAnsi="Times New Roman" w:cs="Times New Roman"/>
+        </w:rPr>
+      </w:pPr>
+    </w:p>
+    <w:p>
+      <w:pPr>
+        <w:rPr>
+          <w:rFonts w:ascii="Times New Roman" w:hAnsi="Times New Roman" w:cs="Times New Roman"/>
+        </w:rPr>
+      </w:pPr>
+    </w:p>
+    <w:p>
+      <w:pPr>
+        <w:rPr>
+          <w:rFonts w:ascii="Times New Roman" w:hAnsi="Times New Roman" w:cs="Times New Roman"/>
+        </w:rPr>
+      </w:pPr>
+    </w:p>
+    <w:p>
+      <w:pPr>
+        <w:rPr>
+          <w:rFonts w:ascii="Times New Roman" w:hAnsi="Times New Roman" w:cs="Times New Roman"/>
+        </w:rPr>
+      </w:pPr>
+    </w:p>
+    <w:p>
+      <w:pPr>
+        <w:rPr>
+          <w:rFonts w:ascii="Times New Roman" w:hAnsi="Times New Roman" w:cs="Times New Roman"/>
+        </w:rPr>
+      </w:pPr>
+    </w:p>
+    <w:p>
+      <w:pPr>
+        <w:rPr>
+          <w:rFonts w:ascii="Times New Roman" w:hAnsi="Times New Roman" w:cs="Times New Roman"/>
+        </w:rPr>
+      </w:pPr>
+    </w:p>
+    <w:p>
+      <w:pPr>
+        <w:rPr>
+          <w:rFonts w:ascii="Times New Roman" w:hAnsi="Times New Roman" w:cs="Times New Roman"/>
+        </w:rPr>
+      </w:pPr>
+    </w:p>
+    <w:p>
+      <w:pPr>
+        <w:rPr>
+          <w:rFonts w:ascii="Times New Roman" w:hAnsi="Times New Roman" w:cs="Times New Roman"/>
+        </w:rPr>
+      </w:pPr>
+    </w:p>
+    <w:p>
+      <w:pPr>
+        <w:rPr>
+          <w:rFonts w:ascii="Times New Roman" w:hAnsi="Times New Roman" w:cs="Times New Roman"/>
+        </w:rPr>
+      </w:pPr>
+    </w:p>
+    <w:p>
+      <w:pPr>
+        <w:rPr>
+          <w:rFonts w:ascii="Times New Roman" w:hAnsi="Times New Roman" w:cs="Times New Roman"/>
+        </w:rPr>
+      </w:pPr>
+    </w:p>
+    <w:p>
+      <w:pPr>
+        <w:rPr>
+          <w:rFonts w:ascii="Times New Roman" w:hAnsi="Times New Roman" w:cs="Times New Roman"/>
+        </w:rPr>
+      </w:pPr>
+    </w:p>
+    <w:p>
+      <w:pPr>
+        <w:rPr>
+          <w:rFonts w:ascii="Times New Roman" w:hAnsi="Times New Roman" w:cs="Times New Roman"/>
+        </w:rPr>
+      </w:pPr>
+    </w:p>
+    <w:p>
+      <w:pPr>
+        <w:rPr>
+          <w:rFonts w:ascii="Times New Roman" w:hAnsi="Times New Roman" w:cs="Times New Roman"/>
+        </w:rPr>
+      </w:pPr>
+    </w:p>
+    <w:p>
+      <w:pPr>
+        <w:rPr>
+          <w:rFonts w:ascii="Times New Roman" w:hAnsi="Times New Roman" w:cs="Times New Roman"/>
+        </w:rPr>
+      </w:pPr>
+    </w:p>
+    <w:p>
+      <w:pPr>
+        <w:rPr>
+          <w:rFonts w:ascii="Times New Roman" w:hAnsi="Times New Roman" w:cs="Times New Roman"/>
+        </w:rPr>
+      </w:pPr>
+    </w:p>
+    <w:p>
+      <w:pPr>
+        <w:rPr>
+          <w:rFonts w:ascii="Times New Roman" w:hAnsi="Times New Roman" w:cs="Times New Roman"/>
+        </w:rPr>
+      </w:pPr>
+    </w:p>
+    <w:p>
+      <w:pPr>
+        <w:rPr>
+          <w:rFonts w:ascii="Times New Roman" w:hAnsi="Times New Roman" w:cs="Times New Roman"/>
           <w:b/>
           <w:bCs/>
           <w:lang w:val="es-ES"/>
@@ -774,6 +907,7 @@
           <w:bCs/>
           <w:lang w:val="es-ES"/>
         </w:rPr>
+        <w:lastRenderedPageBreak/>
         <w:t>RESULTADOS</w:t>
       </w:r>
     </w:p>
@@ -1857,6 +1991,7 @@
         <w:rPr>
           <w:rFonts w:ascii="Times New Roman" w:hAnsi="Times New Roman" w:cs="Times New Roman"/>
         </w:rPr>
+        <w:lastRenderedPageBreak/>
         <w:t>Figura 0</w:t>
       </w:r>
       <w:r>
@@ -3105,6 +3240,7 @@
         <w:rPr>
           <w:rFonts w:ascii="Times New Roman" w:hAnsi="Times New Roman" w:cs="Times New Roman"/>
         </w:rPr>
+        <w:lastRenderedPageBreak/>
         <w:t>Tabla 0</w:t>
       </w:r>
       <w:r>
@@ -4121,7 +4257,6 @@
           <w:noProof/>
           <w:lang w:val="en-US"/>
         </w:rPr>
-        <w:lastRenderedPageBreak/>
         <w:drawing>
           <wp:inline distT="0" distB="0" distL="0" distR="0" wp14:anchorId="58A597EE" wp14:editId="6696799C">
             <wp:extent cx="4578350" cy="1447800"/>
@@ -5122,6 +5257,7 @@
         <w:rPr>
           <w:rFonts w:ascii="Times New Roman" w:hAnsi="Times New Roman" w:cs="Times New Roman"/>
         </w:rPr>
+        <w:lastRenderedPageBreak/>
         <w:t xml:space="preserve">En la figura 04 y en la tabla 04 que describe la valoración de bienes, se puede apreciar que, un 50% así como 30% equivalen al 24 de 30 encuestados, teniendo una apreciación valorativa medio y alto afirmando que la eficiente contrataciones y recursos, en la mayoría tiene una valoración alta permitiendo un proceso estructurado el cual involucra acciones y decisiones dentro de la municipalidad distrital de Tacna.  </w:t>
       </w:r>
     </w:p>
@@ -6328,6 +6464,27 @@
     </w:p>
     <w:p>
       <w:pPr>
+        <w:rPr>
+          <w:rFonts w:ascii="Times New Roman" w:hAnsi="Times New Roman" w:cs="Times New Roman"/>
+        </w:rPr>
+      </w:pPr>
+    </w:p>
+    <w:p>
+      <w:pPr>
+        <w:rPr>
+          <w:rFonts w:ascii="Times New Roman" w:hAnsi="Times New Roman" w:cs="Times New Roman"/>
+        </w:rPr>
+      </w:pPr>
+    </w:p>
+    <w:p>
+      <w:pPr>
+        <w:rPr>
+          <w:rFonts w:ascii="Times New Roman" w:hAnsi="Times New Roman" w:cs="Times New Roman"/>
+        </w:rPr>
+      </w:pPr>
+    </w:p>
+    <w:p>
+      <w:pPr>
         <w:jc w:val="left"/>
         <w:rPr>
           <w:rFonts w:ascii="Times New Roman" w:hAnsi="Times New Roman" w:cs="Times New Roman"/>
@@ -6339,6 +6496,7 @@
         <w:rPr>
           <w:rFonts w:ascii="Times New Roman" w:hAnsi="Times New Roman" w:cs="Times New Roman"/>
         </w:rPr>
+        <w:lastRenderedPageBreak/>
         <w:t>Figura 0</w:t>
       </w:r>
       <w:r>
@@ -7518,73 +7676,87 @@
         <w:rPr>
           <w:rFonts w:ascii="Times New Roman" w:hAnsi="Times New Roman" w:cs="Times New Roman"/>
         </w:rPr>
+        <w:t xml:space="preserve">En la figura 06 y en la tabla 06 que describe a la variable presupuesto, se puede apreciar que el total de los encuestados, el 40% así como el 33,3% equivalen a 22 de los 30 encuestados tienen una apreciación valorativa media y alta al afirmar la planificación presupuestaria, participación ciudadana, viabilidad financiera y marco legal como se puede observar en la mayoría que tiene una valoración alta indicando así un eficiente presupuesto para el impuesto predial dentro de la municipalidad distrital de Tacna. </w:t>
+      </w:r>
+    </w:p>
+    <w:p>
+      <w:pPr>
+        <w:rPr>
+          <w:rFonts w:ascii="Times New Roman" w:hAnsi="Times New Roman" w:cs="Times New Roman"/>
+        </w:rPr>
+      </w:pPr>
+    </w:p>
+    <w:p>
+      <w:pPr>
+        <w:rPr>
+          <w:rFonts w:ascii="Times New Roman" w:hAnsi="Times New Roman" w:cs="Times New Roman"/>
+        </w:rPr>
+      </w:pPr>
+    </w:p>
+    <w:p>
+      <w:pPr>
+        <w:rPr>
+          <w:rFonts w:ascii="Times New Roman" w:hAnsi="Times New Roman" w:cs="Times New Roman"/>
+        </w:rPr>
+      </w:pPr>
+    </w:p>
+    <w:p>
+      <w:pPr>
+        <w:rPr>
+          <w:rFonts w:ascii="Times New Roman" w:hAnsi="Times New Roman" w:cs="Times New Roman"/>
+        </w:rPr>
+      </w:pPr>
+    </w:p>
+    <w:p>
+      <w:pPr>
+        <w:rPr>
+          <w:rFonts w:ascii="Times New Roman" w:hAnsi="Times New Roman" w:cs="Times New Roman"/>
+        </w:rPr>
+      </w:pPr>
+    </w:p>
+    <w:p>
+      <w:pPr>
+        <w:rPr>
+          <w:rFonts w:ascii="Times New Roman" w:hAnsi="Times New Roman" w:cs="Times New Roman"/>
+        </w:rPr>
+      </w:pPr>
+    </w:p>
+    <w:p>
+      <w:pPr>
+        <w:rPr>
+          <w:rFonts w:ascii="Times New Roman" w:hAnsi="Times New Roman" w:cs="Times New Roman"/>
+        </w:rPr>
+      </w:pPr>
+    </w:p>
+    <w:p>
+      <w:pPr>
+        <w:rPr>
+          <w:rFonts w:ascii="Times New Roman" w:hAnsi="Times New Roman" w:cs="Times New Roman"/>
+        </w:rPr>
+      </w:pPr>
+    </w:p>
+    <w:p>
+      <w:pPr>
+        <w:rPr>
+          <w:rFonts w:ascii="Times New Roman" w:hAnsi="Times New Roman" w:cs="Times New Roman"/>
+          <w:lang w:val="es-ES"/>
+        </w:rPr>
+      </w:pPr>
+    </w:p>
+    <w:p>
+      <w:pPr>
+        <w:jc w:val="left"/>
+        <w:rPr>
+          <w:rFonts w:ascii="Times New Roman" w:hAnsi="Times New Roman" w:cs="Times New Roman"/>
+          <w:lang w:val="es-ES"/>
+        </w:rPr>
+      </w:pPr>
+      <w:bookmarkStart w:id="12" w:name="_Toc202657100"/>
+      <w:r>
+        <w:rPr>
+          <w:rFonts w:ascii="Times New Roman" w:hAnsi="Times New Roman" w:cs="Times New Roman"/>
+        </w:rPr>
         <w:lastRenderedPageBreak/>
-        <w:t xml:space="preserve">En la figura 06 y en la tabla 06 que describe a la variable presupuesto, se puede apreciar que el total de los encuestados, el 40% así como el 33,3% equivalen a 22 de los 30 encuestados tienen una apreciación valorativa media y alta al afirmar la planificación presupuestaria, participación ciudadana, viabilidad financiera y marco legal como se puede observar en la mayoría que tiene una valoración alta indicando así un eficiente presupuesto para el impuesto predial dentro de la municipalidad distrital de Tacna. </w:t>
-      </w:r>
-    </w:p>
-    <w:p>
-      <w:pPr>
-        <w:rPr>
-          <w:rFonts w:ascii="Times New Roman" w:hAnsi="Times New Roman" w:cs="Times New Roman"/>
-        </w:rPr>
-      </w:pPr>
-    </w:p>
-    <w:p>
-      <w:pPr>
-        <w:rPr>
-          <w:rFonts w:ascii="Times New Roman" w:hAnsi="Times New Roman" w:cs="Times New Roman"/>
-        </w:rPr>
-      </w:pPr>
-    </w:p>
-    <w:p>
-      <w:pPr>
-        <w:rPr>
-          <w:rFonts w:ascii="Times New Roman" w:hAnsi="Times New Roman" w:cs="Times New Roman"/>
-        </w:rPr>
-      </w:pPr>
-    </w:p>
-    <w:p>
-      <w:pPr>
-        <w:rPr>
-          <w:rFonts w:ascii="Times New Roman" w:hAnsi="Times New Roman" w:cs="Times New Roman"/>
-        </w:rPr>
-      </w:pPr>
-    </w:p>
-    <w:p>
-      <w:pPr>
-        <w:rPr>
-          <w:rFonts w:ascii="Times New Roman" w:hAnsi="Times New Roman" w:cs="Times New Roman"/>
-        </w:rPr>
-      </w:pPr>
-    </w:p>
-    <w:p>
-      <w:pPr>
-        <w:rPr>
-          <w:rFonts w:ascii="Times New Roman" w:hAnsi="Times New Roman" w:cs="Times New Roman"/>
-        </w:rPr>
-      </w:pPr>
-    </w:p>
-    <w:p>
-      <w:pPr>
-        <w:rPr>
-          <w:rFonts w:ascii="Times New Roman" w:hAnsi="Times New Roman" w:cs="Times New Roman"/>
-          <w:lang w:val="es-ES"/>
-        </w:rPr>
-      </w:pPr>
-    </w:p>
-    <w:p>
-      <w:pPr>
-        <w:jc w:val="left"/>
-        <w:rPr>
-          <w:rFonts w:ascii="Times New Roman" w:hAnsi="Times New Roman" w:cs="Times New Roman"/>
-          <w:lang w:val="es-ES"/>
-        </w:rPr>
-      </w:pPr>
-      <w:bookmarkStart w:id="12" w:name="_Toc202657100"/>
-      <w:r>
-        <w:rPr>
-          <w:rFonts w:ascii="Times New Roman" w:hAnsi="Times New Roman" w:cs="Times New Roman"/>
-        </w:rPr>
         <w:t>Figura 0</w:t>
       </w:r>
       <w:r>
@@ -8765,14 +8937,7 @@
         <w:rPr>
           <w:rFonts w:ascii="Times New Roman" w:hAnsi="Times New Roman" w:cs="Times New Roman"/>
         </w:rPr>
-        <w:t xml:space="preserve">En la figura 07 y en la tabla 07 que describe la dimensión Gastos públicos, se puede apreciar que un 46,67% así como 36,7% equivalen al 25 de 30 encuestados, teniendo una </w:t>
-      </w:r>
-      <w:r>
-        <w:rPr>
-          <w:rFonts w:ascii="Times New Roman" w:hAnsi="Times New Roman" w:cs="Times New Roman"/>
-        </w:rPr>
-        <w:lastRenderedPageBreak/>
-        <w:t xml:space="preserve">apreciación valorativa medio y alto afirmando </w:t>
+        <w:t xml:space="preserve">En la figura 07 y en la tabla 07 que describe la dimensión Gastos públicos, se puede apreciar que un 46,67% así como 36,7% equivalen al 25 de 30 encuestados, teniendo una apreciación valorativa medio y alto afirmando </w:t>
       </w:r>
       <w:proofErr w:type="gramStart"/>
       <w:r>
@@ -9037,6 +9202,7 @@
         <w:rPr>
           <w:rFonts w:ascii="Times New Roman" w:hAnsi="Times New Roman" w:cs="Times New Roman"/>
         </w:rPr>
+        <w:lastRenderedPageBreak/>
         <w:t>Tabla 0</w:t>
       </w:r>
       <w:r>
@@ -10046,7 +10212,6 @@
           <w:noProof/>
           <w:lang w:val="en-US"/>
         </w:rPr>
-        <w:lastRenderedPageBreak/>
         <mc:AlternateContent>
           <mc:Choice Requires="wps">
             <w:drawing>
@@ -11172,6 +11337,7 @@
         <w:rPr>
           <w:rFonts w:ascii="Times New Roman" w:hAnsi="Times New Roman" w:cs="Times New Roman"/>
         </w:rPr>
+        <w:lastRenderedPageBreak/>
         <w:t>En la figura 09 y en la tabla 09 que describe la dimensión Viabilidad Financiera, se puede apreciar que, un 50% así como 40% equivalen al 27 de 30 encuestados, teniendo una apreciación valorativa medio y alto afirmando que la económica financiera e ingresos, en la mayoría la valoración es alta permitiendo un comportamiento positivo en los recursos públicos y control de gastos permitiendo una estructura financiera solida en la municipalidad distrital de Tacna.</w:t>
       </w:r>
     </w:p>
@@ -11434,7 +11600,6 @@
         <w:rPr>
           <w:rFonts w:ascii="Times New Roman" w:hAnsi="Times New Roman" w:cs="Times New Roman"/>
         </w:rPr>
-        <w:lastRenderedPageBreak/>
         <w:t xml:space="preserve">Tabla </w:t>
       </w:r>
       <w:r>
@@ -12417,6 +12582,13 @@
       <w:pPr>
         <w:rPr>
           <w:rFonts w:ascii="Times New Roman" w:hAnsi="Times New Roman" w:cs="Times New Roman"/>
+        </w:rPr>
+      </w:pPr>
+    </w:p>
+    <w:p>
+      <w:pPr>
+        <w:rPr>
+          <w:rFonts w:ascii="Times New Roman" w:hAnsi="Times New Roman" w:cs="Times New Roman"/>
           <w:b/>
           <w:bCs/>
           <w:lang w:val="es-ES"/>
@@ -12429,6 +12601,7 @@
           <w:bCs/>
           <w:lang w:val="es-ES"/>
         </w:rPr>
+        <w:lastRenderedPageBreak/>
         <w:t>DISCUSION</w:t>
       </w:r>
     </w:p>
@@ -12488,47 +12661,45 @@
           <w:noProof/>
           <w:lang w:val="es-ES"/>
         </w:rPr>
-        <w:t xml:space="preserve">coindicden en que sus resultados expresan un incremento de la recaudacion de los impuestos ya que a </w:t>
-      </w:r>
-      <w:r>
-        <w:rPr>
-          <w:rFonts w:ascii="Times New Roman" w:hAnsi="Times New Roman" w:cs="Times New Roman"/>
-          <w:noProof/>
-          <w:lang w:val="es-ES"/>
+        <w:t xml:space="preserve">coindicden en que sus resultados expresan un incremento de la recaudacion de los impuestos ya que a travez de tener un proceso adecaudo de planificacion y organización se ah incrementado la recaudacion del impuesto predial,obteniendo en su investigacion el resultado de Rho spearman que alcanzo el 0.653 obteniendo una relacion directa en sus variables lo cual refleja la covergencia del autor mencionado, por el contrario los autores, </w:t>
+      </w:r>
+      <w:bookmarkStart w:id="22" w:name="_Hlk203775321"/>
+      <w:r>
+        <w:rPr>
+          <w:rFonts w:ascii="Times New Roman" w:hAnsi="Times New Roman" w:cs="Times New Roman"/>
+          <w:noProof/>
+          <w:lang w:val="es-ES"/>
+        </w:rPr>
+        <w:t xml:space="preserve">Tutiven &amp; Soledispa (2024), </w:t>
+      </w:r>
+      <w:bookmarkEnd w:id="22"/>
+      <w:r>
+        <w:rPr>
+          <w:rFonts w:ascii="Times New Roman" w:hAnsi="Times New Roman" w:cs="Times New Roman"/>
+          <w:noProof/>
+          <w:lang w:val="es-ES"/>
+        </w:rPr>
+        <w:t xml:space="preserve">en su investigacion sobre la recaudacion de inpuestos prediales en el municipio de lomas sargentillo, sus resultados significativos revelaron que hubo un incremento en la cantidad de contribuyentes que no pagaron sus impuestos, donde la recaudacion enfrenta un desafio de su cultura trtibutaria destacando asi los problemas en la gestion administrativa.  </w:t>
+      </w:r>
+    </w:p>
+    <w:p>
+      <w:pPr>
+        <w:rPr>
+          <w:rFonts w:ascii="Times New Roman" w:hAnsi="Times New Roman" w:cs="Times New Roman"/>
+        </w:rPr>
+      </w:pPr>
+      <w:r>
+        <w:rPr>
+          <w:rFonts w:ascii="Times New Roman" w:hAnsi="Times New Roman" w:cs="Times New Roman"/>
+        </w:rPr>
+        <w:t xml:space="preserve">En cuanto el primer objetivo específico, se determinó que el nivel de percepción de la dimensión cumplimiento tributario se sitúa en un nivel alto de con un  46,7%, porcentaje que se relaciona de manera directa media, con el resultado de percepción de variable presupuesto, la misma que también se sitúa en el nivel alto con un 40,0%, de esta manera se demuestra una correlación directa media entre la dimensión y variable mencionada, ya que mayor nivel de percepción en una también se evidencia mayor nivel de percepción en la otra. Por otro lado, se determinó una correlación “Rho” de Spearman igual a 0.382 (r=0.382), siendo un valor que se encuentra en el rango de correlación directa, con una orientación positiva entre la dimensión cumplimiento tributario y la variable presupuesta. </w:t>
+      </w:r>
+      <w:r>
+        <w:rPr>
+          <w:rFonts w:ascii="Times New Roman" w:hAnsi="Times New Roman" w:cs="Times New Roman"/>
         </w:rPr>
         <w:lastRenderedPageBreak/>
-        <w:t xml:space="preserve">travez de tener un proceso adecaudo de planificacion y organización se ah incrementado la recaudacion del impuesto predial,obteniendo en su investigacion el resultado de Rho spearman que alcanzo el 0.653 obteniendo una relacion directa en sus variables lo cual refleja la covergencia del autor mencionado, por el contrario los autores, </w:t>
-      </w:r>
-      <w:bookmarkStart w:id="22" w:name="_Hlk203775321"/>
-      <w:r>
-        <w:rPr>
-          <w:rFonts w:ascii="Times New Roman" w:hAnsi="Times New Roman" w:cs="Times New Roman"/>
-          <w:noProof/>
-          <w:lang w:val="es-ES"/>
-        </w:rPr>
-        <w:t xml:space="preserve">Tutiven &amp; Soledispa (2024), </w:t>
-      </w:r>
-      <w:bookmarkEnd w:id="22"/>
-      <w:r>
-        <w:rPr>
-          <w:rFonts w:ascii="Times New Roman" w:hAnsi="Times New Roman" w:cs="Times New Roman"/>
-          <w:noProof/>
-          <w:lang w:val="es-ES"/>
-        </w:rPr>
-        <w:t xml:space="preserve">en su investigacion sobre la recaudacion de inpuestos prediales en el municipio de lomas sargentillo, sus resultados significativos revelaron que hubo un incremento en la cantidad de contribuyentes que no pagaron sus impuestos, donde la recaudacion enfrenta un desafio de su cultura trtibutaria destacando asi los problemas en la gestion administrativa.  </w:t>
-      </w:r>
-    </w:p>
-    <w:p>
-      <w:pPr>
-        <w:rPr>
-          <w:rFonts w:ascii="Times New Roman" w:hAnsi="Times New Roman" w:cs="Times New Roman"/>
-        </w:rPr>
-      </w:pPr>
-      <w:r>
-        <w:rPr>
-          <w:rFonts w:ascii="Times New Roman" w:hAnsi="Times New Roman" w:cs="Times New Roman"/>
-        </w:rPr>
-        <w:t>En cuanto el primer objetivo específico, se determinó que el nivel de percepción de la dimensión cumplimiento tributario se sitúa en un nivel alto de con un  46,7%, porcentaje que se relaciona de manera directa media, con el resultado de percepción de variable presupuesto, la misma que también se sitúa en el nivel alto con un 40,0%, de esta manera se demuestra una correlación directa media entre la dimensión y variable mencionada, ya que mayor nivel de percepción en una también se evidencia mayor nivel de percepción en la otra. Por otro lado, se determinó una correlación “Rho” de Spearman igual a 0.382 (r=0.382), siendo un valor que se encuentra en el rango de correlación directa, con una orientación positiva entre la dimensión cumplimiento tributario y la variable presupuesta. Además, se obtuvo el p-valor “Sig. Bilateral” p=0.008 (p&lt;0.05) lo que conlleva a aceptar la Ha, demostrándose la existencia de una relación significativa entre la dimensión y variable mencionada. Lo que nos lleva a considerar la perspectiva de los autores</w:t>
+        <w:t>Además, se obtuvo el p-valor “Sig. Bilateral” p=0.008 (p&lt;0.05) lo que conlleva a aceptar la Ha, demostrándose la existencia de una relación significativa entre la dimensión y variable mencionada. Lo que nos lleva a considerar la perspectiva de los autores</w:t>
       </w:r>
       <w:bookmarkStart w:id="23" w:name="_Hlk203775332"/>
       <w:r>
@@ -12624,7 +12795,112 @@
           <w:noProof/>
           <w:lang w:val="es-ES"/>
         </w:rPr>
-        <w:t xml:space="preserve">en su investigacion determiando que existe una relacion de manera significativa con la recaudacion tributaria obteniendo un 60%, aunque no se llego a lo maximo estimado que fue de 7,320,094 si no </w:t>
+        <w:t>en su investigacion determiando que existe una relacion de manera significativa con la recaudacion tributaria obteniendo un 60%, aunque no se llego a lo maximo estimado que fue de 7,320,094 si no que se llego a 6,724,656, teniendo en cuenta que se vio afectada por la pandemia COVID 19.</w:t>
+      </w:r>
+    </w:p>
+    <w:p>
+      <w:pPr>
+        <w:rPr>
+          <w:rFonts w:ascii="Times New Roman" w:hAnsi="Times New Roman" w:cs="Times New Roman"/>
+        </w:rPr>
+      </w:pPr>
+      <w:r>
+        <w:rPr>
+          <w:rFonts w:ascii="Times New Roman" w:hAnsi="Times New Roman" w:cs="Times New Roman"/>
+        </w:rPr>
+        <w:t xml:space="preserve">En lo que respecta al segundo objetivo específico, se determinó que el nivel de percepción de la dimensión contribuyentes se sitúa en un nivel alto con         un 60,0%, porcentaje que se relaciona de manera directa con el resultado de percepción de la variable presupuesto, la misma que también se sitúa en el nivel alto con un 40,0%, de esta manera se demuestra una correlación directa media entre la dimensión y la variable mencionada, ya que a mayor nivel de percepción en una también se evidencia mayor nivel de percepción en la otra. Por otro lado, se determinó una correlación “Rho” de Spearman igual a 0.613 (r=0.613), siendo este un valor que se encuentra en el rango de correlación directa media, con una orientación positiva entre la dimensión contribuyentes y la </w:t>
+      </w:r>
+      <w:proofErr w:type="gramStart"/>
+      <w:r>
+        <w:rPr>
+          <w:rFonts w:ascii="Times New Roman" w:hAnsi="Times New Roman" w:cs="Times New Roman"/>
+        </w:rPr>
+        <w:t>variable presupuesto</w:t>
+      </w:r>
+      <w:proofErr w:type="gramEnd"/>
+      <w:r>
+        <w:rPr>
+          <w:rFonts w:ascii="Times New Roman" w:hAnsi="Times New Roman" w:cs="Times New Roman"/>
+        </w:rPr>
+        <w:t xml:space="preserve">. Además, se obtuvo el p-valor “sig. Bilateral” p=0.000 (p&lt;0.05) lo que nos conlleva aceptar la Ha, demostrando la existencia de una relación directa media entre la dimensión y variable mencionada. Lo que nos lleva a considerar la perspectiva del autor </w:t>
+      </w:r>
+      <w:bookmarkStart w:id="26" w:name="_Hlk203775394"/>
+      <w:r>
+        <w:rPr>
+          <w:rFonts w:ascii="Times New Roman" w:hAnsi="Times New Roman" w:cs="Times New Roman"/>
+          <w:noProof/>
+        </w:rPr>
+        <w:t>Gaspar</w:t>
+      </w:r>
+      <w:r>
+        <w:rPr>
+          <w:rFonts w:ascii="Times New Roman" w:hAnsi="Times New Roman" w:cs="Times New Roman"/>
+          <w:noProof/>
+        </w:rPr>
+        <w:t xml:space="preserve"> y otros </w:t>
+      </w:r>
+      <w:r>
+        <w:rPr>
+          <w:rFonts w:ascii="Times New Roman" w:hAnsi="Times New Roman" w:cs="Times New Roman"/>
+          <w:noProof/>
+        </w:rPr>
+        <w:t xml:space="preserve"> (2021)</w:t>
+      </w:r>
+      <w:r>
+        <w:rPr>
+          <w:rFonts w:ascii="Times New Roman" w:hAnsi="Times New Roman" w:cs="Times New Roman"/>
+          <w:noProof/>
+          <w:lang w:val="es-ES"/>
+        </w:rPr>
+        <w:t xml:space="preserve">, </w:t>
+      </w:r>
+      <w:bookmarkEnd w:id="26"/>
+      <w:r>
+        <w:rPr>
+          <w:rFonts w:ascii="Times New Roman" w:hAnsi="Times New Roman" w:cs="Times New Roman"/>
+          <w:noProof/>
+          <w:lang w:val="es-ES"/>
+        </w:rPr>
+        <w:t xml:space="preserve">en sus objetivos propuesto tiene una nocion en formalidad de los cobros de los contribuyentes, organizandoce con sus tributos y sus funcionalidades contables poniendo en marcha las operaciones y calendario de declaraciones de obligaciones tributarias, de igual forma el el autor, </w:t>
+      </w:r>
+      <w:bookmarkStart w:id="27" w:name="_Hlk203775416"/>
+      <w:r>
+        <w:rPr>
+          <w:rFonts w:ascii="Times New Roman" w:hAnsi="Times New Roman" w:cs="Times New Roman"/>
+          <w:noProof/>
+        </w:rPr>
+        <w:t>Rituay  &amp; Baylon (2024)</w:t>
+      </w:r>
+      <w:r>
+        <w:rPr>
+          <w:rFonts w:ascii="Times New Roman" w:hAnsi="Times New Roman" w:cs="Times New Roman"/>
+          <w:noProof/>
+        </w:rPr>
+        <w:t>,</w:t>
+      </w:r>
+      <w:r>
+        <w:rPr>
+          <w:rFonts w:ascii="Times New Roman" w:hAnsi="Times New Roman" w:cs="Times New Roman"/>
+          <w:noProof/>
+        </w:rPr>
+        <w:t xml:space="preserve"> </w:t>
+      </w:r>
+      <w:r>
+        <w:rPr>
+          <w:rFonts w:ascii="Times New Roman" w:hAnsi="Times New Roman" w:cs="Times New Roman"/>
+          <w:noProof/>
+          <w:lang w:val="es-ES"/>
+        </w:rPr>
+        <w:t xml:space="preserve"> </w:t>
+      </w:r>
+      <w:bookmarkEnd w:id="27"/>
+      <w:r>
+        <w:rPr>
+          <w:rFonts w:ascii="Times New Roman" w:hAnsi="Times New Roman" w:cs="Times New Roman"/>
+          <w:noProof/>
+          <w:lang w:val="es-ES"/>
+        </w:rPr>
+        <w:t xml:space="preserve">afirma que para mejorar el sistema tributario se debe tener una buena gestion de cobros de impuestos, </w:t>
       </w:r>
       <w:r>
         <w:rPr>
@@ -12633,20 +12909,64 @@
           <w:lang w:val="es-ES"/>
         </w:rPr>
         <w:lastRenderedPageBreak/>
-        <w:t>que se llego a 6,724,656, teniendo en cuenta que se vio afectada por la pandemia COVID 19.</w:t>
-      </w:r>
-    </w:p>
-    <w:p>
-      <w:pPr>
-        <w:rPr>
-          <w:rFonts w:ascii="Times New Roman" w:hAnsi="Times New Roman" w:cs="Times New Roman"/>
-        </w:rPr>
-      </w:pPr>
-      <w:r>
-        <w:rPr>
-          <w:rFonts w:ascii="Times New Roman" w:hAnsi="Times New Roman" w:cs="Times New Roman"/>
-        </w:rPr>
-        <w:t xml:space="preserve">En lo que respecta al segundo objetivo específico, se determinó que el nivel de percepción de la dimensión contribuyentes se sitúa en un nivel alto con         un 60,0%, porcentaje que se relaciona de manera directa con el resultado de percepción de la variable presupuesto, la misma que también se sitúa en el nivel alto con un 40,0%, de esta manera se demuestra una correlación directa media entre la dimensión y la variable mencionada, ya que a mayor nivel de percepción en una también se evidencia mayor nivel de percepción en la otra. Por otro lado, se determinó una correlación “Rho” de Spearman igual a 0.613 (r=0.613), siendo este un valor que se encuentra en el rango de correlación directa media, con una orientación positiva entre la dimensión contribuyentes y la </w:t>
+        <w:t xml:space="preserve">con responsabilidad de los gobiernos locales, pero requiere que los contribuyentes comprendan la importancia de cumplir con sus obligaciones tributarias, basandose en la una cultura tributaria, coincidiendo con el autor </w:t>
+      </w:r>
+      <w:bookmarkStart w:id="28" w:name="_Hlk203775488"/>
+      <w:r>
+        <w:rPr>
+          <w:rFonts w:ascii="Times New Roman" w:hAnsi="Times New Roman" w:cs="Times New Roman"/>
+          <w:noProof/>
+        </w:rPr>
+        <w:t>Romero</w:t>
+      </w:r>
+      <w:r>
+        <w:rPr>
+          <w:rFonts w:ascii="Times New Roman" w:hAnsi="Times New Roman" w:cs="Times New Roman"/>
+          <w:noProof/>
+        </w:rPr>
+        <w:t xml:space="preserve"> y otros</w:t>
+      </w:r>
+      <w:r>
+        <w:rPr>
+          <w:rFonts w:ascii="Times New Roman" w:hAnsi="Times New Roman" w:cs="Times New Roman"/>
+          <w:noProof/>
+        </w:rPr>
+        <w:t xml:space="preserve"> (2021)</w:t>
+      </w:r>
+      <w:r>
+        <w:rPr>
+          <w:rFonts w:ascii="Times New Roman" w:hAnsi="Times New Roman" w:cs="Times New Roman"/>
+          <w:noProof/>
+        </w:rPr>
+        <w:t>,</w:t>
+      </w:r>
+      <w:r>
+        <w:rPr>
+          <w:rFonts w:ascii="Times New Roman" w:hAnsi="Times New Roman" w:cs="Times New Roman"/>
+          <w:noProof/>
+        </w:rPr>
+        <w:t xml:space="preserve"> </w:t>
+      </w:r>
+      <w:bookmarkEnd w:id="28"/>
+      <w:r>
+        <w:rPr>
+          <w:rFonts w:ascii="Times New Roman" w:hAnsi="Times New Roman" w:cs="Times New Roman"/>
+          <w:noProof/>
+        </w:rPr>
+        <w:t>quien en su investigacion recalca el compromiso que involucran a todos que asuman sus responsabilidades creando la conciencia de pago, lo cual influye en mejorar los estamentos legales para un bien comun estableciendo normas mas justas y equitativas para para que las personas puedan cumplir con su pagos.</w:t>
+      </w:r>
+    </w:p>
+    <w:p>
+      <w:pPr>
+        <w:rPr>
+          <w:rFonts w:ascii="Times New Roman" w:hAnsi="Times New Roman" w:cs="Times New Roman"/>
+        </w:rPr>
+      </w:pPr>
+      <w:r>
+        <w:rPr>
+          <w:rFonts w:ascii="Times New Roman" w:hAnsi="Times New Roman" w:cs="Times New Roman"/>
+        </w:rPr>
+        <w:t xml:space="preserve">Con respecto al tercer objetivo específico, se determinó que el nivel de percepción de la dimensión valoración de bienes se sitúa en un nivel alto con un 50%, porcentaje que se relaciona de manera directa con el resultado de percepción de la variable presupuesto, la misma que también se sitúa en el nivel medio con un 30%, de esta manera se demuestra una correlación directa media entre la dimensión y la variable mencionada, ya que a mayor nivel de percepción en una también se evidencia mayor nivel de percepción que en la otra.  Por otro lado, se determinó una correlación “Rho” de Spearman igual a 0.505 (r=0.505), siendo este un valor que se encuentra en el rango de correlación directa media, con una orientación positiva entre la dimensión valoración de bienes y la </w:t>
       </w:r>
       <w:proofErr w:type="gramStart"/>
       <w:r>
@@ -12660,15 +12980,64 @@
         <w:rPr>
           <w:rFonts w:ascii="Times New Roman" w:hAnsi="Times New Roman" w:cs="Times New Roman"/>
         </w:rPr>
-        <w:t xml:space="preserve">. Además, se obtuvo el p-valor “sig. Bilateral” p=0.000 (p&lt;0.05) lo que nos conlleva aceptar la Ha, demostrando la existencia de una relación directa media entre la dimensión y variable mencionada. Lo que nos lleva a considerar la perspectiva del autor </w:t>
-      </w:r>
-      <w:bookmarkStart w:id="26" w:name="_Hlk203775394"/>
-      <w:r>
-        <w:rPr>
-          <w:rFonts w:ascii="Times New Roman" w:hAnsi="Times New Roman" w:cs="Times New Roman"/>
-          <w:noProof/>
-        </w:rPr>
-        <w:t>Gaspar</w:t>
+        <w:t xml:space="preserve">. Además, se obtuvo el p-valor “sig. Bilateral” p=0.004(p&lt;0.05) lo que nos conlleva a aceptar la Ha, demostrando la existencia de una relación directa media entre la dimensión y variable presupuesto. De igual forma  los autores, </w:t>
+      </w:r>
+      <w:r>
+        <w:rPr>
+          <w:rFonts w:ascii="Times New Roman" w:hAnsi="Times New Roman" w:cs="Times New Roman"/>
+          <w:noProof/>
+        </w:rPr>
+        <w:t xml:space="preserve">Tutiven &amp; Soledispa (2024), en su investigacion </w:t>
+      </w:r>
+      <w:r>
+        <w:rPr>
+          <w:rFonts w:ascii="Times New Roman" w:hAnsi="Times New Roman" w:cs="Times New Roman"/>
+        </w:rPr>
+        <w:t xml:space="preserve">la percepción por parte de los ciudadanos de la ciudad de sargentillo en su recaudación de los impuestos prediales fue positiva con un 73% </w:t>
+      </w:r>
+      <w:proofErr w:type="spellStart"/>
+      <w:r>
+        <w:rPr>
+          <w:rFonts w:ascii="Times New Roman" w:hAnsi="Times New Roman" w:cs="Times New Roman"/>
+        </w:rPr>
+        <w:t>porciento</w:t>
+      </w:r>
+      <w:proofErr w:type="spellEnd"/>
+      <w:r>
+        <w:rPr>
+          <w:rFonts w:ascii="Times New Roman" w:hAnsi="Times New Roman" w:cs="Times New Roman"/>
+        </w:rPr>
+        <w:t xml:space="preserve"> de sus encuestados, considerando que es una herramienta útil para el desarrollo de la comunidad, el apoyo fue gracias a una base sólida y la implementación de una política fiscal enfocadas en las transparencias en uso de los recursos públicos, mientras que los autores,  </w:t>
+      </w:r>
+      <w:bookmarkStart w:id="29" w:name="_Hlk203775523"/>
+      <w:r>
+        <w:rPr>
+          <w:rFonts w:ascii="Times New Roman" w:hAnsi="Times New Roman" w:cs="Times New Roman"/>
+          <w:noProof/>
+        </w:rPr>
+        <w:t xml:space="preserve">Vargas </w:t>
+      </w:r>
+      <w:r>
+        <w:rPr>
+          <w:rFonts w:ascii="Times New Roman" w:hAnsi="Times New Roman" w:cs="Times New Roman"/>
+          <w:noProof/>
+        </w:rPr>
+        <w:t>y otros</w:t>
+      </w:r>
+      <w:r>
+        <w:rPr>
+          <w:rFonts w:ascii="Times New Roman" w:hAnsi="Times New Roman" w:cs="Times New Roman"/>
+          <w:noProof/>
+        </w:rPr>
+        <w:t xml:space="preserve">  (2022) </w:t>
+      </w:r>
+      <w:bookmarkEnd w:id="29"/>
+      <w:r>
+        <w:rPr>
+          <w:rFonts w:ascii="Times New Roman" w:hAnsi="Times New Roman" w:cs="Times New Roman"/>
+          <w:noProof/>
+        </w:rPr>
+        <w:t>y  en su investigacion se analizo la eficiente ejecucion de sus programas presupuestales teniendo como prioridad el  analisis ecometrico y regresion lineal multiple, ya que fueron seleccionados en su mayor incidencia en los gobiernos locales, resaltando el el rol presupuestal, siendo esto el rol mas activo, por otro lado la investiagacion de los autores, Vargas</w:t>
       </w:r>
       <w:r>
         <w:rPr>
@@ -12682,127 +13051,23 @@
           <w:rFonts w:ascii="Times New Roman" w:hAnsi="Times New Roman" w:cs="Times New Roman"/>
           <w:noProof/>
         </w:rPr>
-        <w:t xml:space="preserve"> (2021)</w:t>
-      </w:r>
-      <w:r>
-        <w:rPr>
-          <w:rFonts w:ascii="Times New Roman" w:hAnsi="Times New Roman" w:cs="Times New Roman"/>
-          <w:noProof/>
-          <w:lang w:val="es-ES"/>
-        </w:rPr>
-        <w:t xml:space="preserve">, </w:t>
-      </w:r>
-      <w:bookmarkEnd w:id="26"/>
-      <w:r>
-        <w:rPr>
-          <w:rFonts w:ascii="Times New Roman" w:hAnsi="Times New Roman" w:cs="Times New Roman"/>
-          <w:noProof/>
-          <w:lang w:val="es-ES"/>
-        </w:rPr>
-        <w:t xml:space="preserve">en sus objetivos propuesto tiene una nocion en formalidad de los cobros de los contribuyentes, organizandoce con sus tributos y sus funcionalidades contables poniendo en marcha las operaciones y calendario de declaraciones de obligaciones tributarias, de igual forma el el autor, </w:t>
-      </w:r>
-      <w:bookmarkStart w:id="27" w:name="_Hlk203775416"/>
-      <w:r>
-        <w:rPr>
-          <w:rFonts w:ascii="Times New Roman" w:hAnsi="Times New Roman" w:cs="Times New Roman"/>
-          <w:noProof/>
-        </w:rPr>
-        <w:t>Rituay  &amp; Baylon (2024)</w:t>
-      </w:r>
-      <w:r>
-        <w:rPr>
-          <w:rFonts w:ascii="Times New Roman" w:hAnsi="Times New Roman" w:cs="Times New Roman"/>
-          <w:noProof/>
-        </w:rPr>
-        <w:t>,</w:t>
-      </w:r>
-      <w:r>
-        <w:rPr>
-          <w:rFonts w:ascii="Times New Roman" w:hAnsi="Times New Roman" w:cs="Times New Roman"/>
-          <w:noProof/>
-        </w:rPr>
-        <w:t xml:space="preserve"> </w:t>
-      </w:r>
-      <w:r>
-        <w:rPr>
-          <w:rFonts w:ascii="Times New Roman" w:hAnsi="Times New Roman" w:cs="Times New Roman"/>
-          <w:noProof/>
-          <w:lang w:val="es-ES"/>
-        </w:rPr>
-        <w:t xml:space="preserve"> </w:t>
-      </w:r>
-      <w:bookmarkEnd w:id="27"/>
-      <w:r>
-        <w:rPr>
-          <w:rFonts w:ascii="Times New Roman" w:hAnsi="Times New Roman" w:cs="Times New Roman"/>
-          <w:noProof/>
-          <w:lang w:val="es-ES"/>
-        </w:rPr>
-        <w:t xml:space="preserve">afirma que para mejorar el sistema tributario se debe tener una buena gestion de cobros de impuestos, con responsabilidad de los gobiernos locales, pero requiere que los contribuyentes comprendan la importancia de cumplir con sus obligaciones tributarias, basandose en la una cultura tributaria, coincidiendo con el autor </w:t>
-      </w:r>
-      <w:bookmarkStart w:id="28" w:name="_Hlk203775488"/>
-      <w:r>
-        <w:rPr>
-          <w:rFonts w:ascii="Times New Roman" w:hAnsi="Times New Roman" w:cs="Times New Roman"/>
-          <w:noProof/>
-        </w:rPr>
-        <w:t>Romero</w:t>
-      </w:r>
-      <w:r>
-        <w:rPr>
-          <w:rFonts w:ascii="Times New Roman" w:hAnsi="Times New Roman" w:cs="Times New Roman"/>
-          <w:noProof/>
-        </w:rPr>
-        <w:t xml:space="preserve"> y otros</w:t>
-      </w:r>
-      <w:r>
-        <w:rPr>
-          <w:rFonts w:ascii="Times New Roman" w:hAnsi="Times New Roman" w:cs="Times New Roman"/>
-          <w:noProof/>
-        </w:rPr>
-        <w:t xml:space="preserve"> (2021)</w:t>
-      </w:r>
-      <w:r>
-        <w:rPr>
-          <w:rFonts w:ascii="Times New Roman" w:hAnsi="Times New Roman" w:cs="Times New Roman"/>
-          <w:noProof/>
-        </w:rPr>
-        <w:t>,</w:t>
-      </w:r>
-      <w:r>
-        <w:rPr>
-          <w:rFonts w:ascii="Times New Roman" w:hAnsi="Times New Roman" w:cs="Times New Roman"/>
-          <w:noProof/>
-        </w:rPr>
-        <w:t xml:space="preserve"> </w:t>
-      </w:r>
-      <w:bookmarkEnd w:id="28"/>
-      <w:r>
-        <w:rPr>
-          <w:rFonts w:ascii="Times New Roman" w:hAnsi="Times New Roman" w:cs="Times New Roman"/>
-          <w:noProof/>
-        </w:rPr>
-        <w:t>quien en su investigacion recalca el compromiso que involucran a todos que asuman sus responsabilidades creando la conciencia de pago, lo cual influye en mejorar los estamentos legales para un bien comun estableciendo normas mas justas y equitativas para para que las personas puedan cumplir con su pagos.</w:t>
-      </w:r>
-    </w:p>
-    <w:p>
-      <w:pPr>
-        <w:rPr>
-          <w:rFonts w:ascii="Times New Roman" w:hAnsi="Times New Roman" w:cs="Times New Roman"/>
-        </w:rPr>
-      </w:pPr>
-      <w:r>
-        <w:rPr>
-          <w:rFonts w:ascii="Times New Roman" w:hAnsi="Times New Roman" w:cs="Times New Roman"/>
-        </w:rPr>
-        <w:t xml:space="preserve">Con respecto al tercer objetivo específico, se determinó que el nivel de percepción de la dimensión valoración de bienes se sitúa en un nivel alto con un 50%, porcentaje que se relaciona de manera directa con el resultado de percepción de la variable presupuesto, la misma que también se sitúa en el nivel medio con un 30%, de esta manera se demuestra una correlación directa media entre la dimensión y la variable mencionada, ya que a mayor nivel de percepción en una también se evidencia mayor nivel de percepción que en la otra.  Por otro lado, se determinó una correlación “Rho” de Spearman igual a 0.505 (r=0.505), siendo este un valor que se encuentra en el rango de correlación directa media, </w:t>
-      </w:r>
+        <w:t>(2022), regulan los impuestos predial caracterizado por una debilidad institucional recpecto al derecho de la propiedad y un gran aumento de despojo y violencia de las propiedades, lo causo un progresivo reaudo del impuesto, por este sentido se permitio buscar de bienes y servicios de manera privada.</w:t>
+      </w:r>
+    </w:p>
+    <w:p>
+      <w:pPr>
+        <w:rPr>
+          <w:rFonts w:ascii="Times New Roman" w:hAnsi="Times New Roman" w:cs="Times New Roman"/>
+          <w:noProof/>
+          <w:lang w:val="es-ES"/>
+        </w:rPr>
+      </w:pPr>
       <w:r>
         <w:rPr>
           <w:rFonts w:ascii="Times New Roman" w:hAnsi="Times New Roman" w:cs="Times New Roman"/>
         </w:rPr>
         <w:lastRenderedPageBreak/>
-        <w:t xml:space="preserve">con una orientación positiva entre la dimensión valoración de bienes y la </w:t>
+        <w:t xml:space="preserve">Y por último el cuarto objetivo específico, se determinó que el nivel de percepción de la dimensión determinación tributaria se sitúa en un nivel alto con 40%, porcentaje que se relaciona de manera directa con el resultado de percepción de la variable presupuesto,  la misma que también se sitúa en el  nivel medio con un 30%, de esta manera se demuestra una correlación directa media entra la dimensión y la variable mencionada, ya que a mayor nivel de percepción en una también se evidencia mayor nivel de percepción que en la otra. Por otro lado, se determinó unca correlación “Rho” de Spearman igual a 0.524(r=0524), con una orientación positiva entre la dimensión valoración de determinación tributaria y la </w:t>
       </w:r>
       <w:proofErr w:type="gramStart"/>
       <w:r>
@@ -12816,106 +13081,6 @@
         <w:rPr>
           <w:rFonts w:ascii="Times New Roman" w:hAnsi="Times New Roman" w:cs="Times New Roman"/>
         </w:rPr>
-        <w:t xml:space="preserve">. Además, se obtuvo el p-valor “sig. Bilateral” p=0.004(p&lt;0.05) lo que nos conlleva a aceptar la Ha, demostrando la existencia de una relación directa media entre la dimensión y variable presupuesto. De igual forma  los autores, </w:t>
-      </w:r>
-      <w:r>
-        <w:rPr>
-          <w:rFonts w:ascii="Times New Roman" w:hAnsi="Times New Roman" w:cs="Times New Roman"/>
-          <w:noProof/>
-        </w:rPr>
-        <w:t xml:space="preserve">Tutiven &amp; Soledispa (2024), en su investigacion </w:t>
-      </w:r>
-      <w:r>
-        <w:rPr>
-          <w:rFonts w:ascii="Times New Roman" w:hAnsi="Times New Roman" w:cs="Times New Roman"/>
-        </w:rPr>
-        <w:t xml:space="preserve">la percepción por parte de los ciudadanos de la ciudad de sargentillo en su recaudación de los impuestos prediales fue positiva con un 73% </w:t>
-      </w:r>
-      <w:proofErr w:type="spellStart"/>
-      <w:r>
-        <w:rPr>
-          <w:rFonts w:ascii="Times New Roman" w:hAnsi="Times New Roman" w:cs="Times New Roman"/>
-        </w:rPr>
-        <w:t>porciento</w:t>
-      </w:r>
-      <w:proofErr w:type="spellEnd"/>
-      <w:r>
-        <w:rPr>
-          <w:rFonts w:ascii="Times New Roman" w:hAnsi="Times New Roman" w:cs="Times New Roman"/>
-        </w:rPr>
-        <w:t xml:space="preserve"> de sus encuestados, considerando que es una herramienta útil para el desarrollo de la comunidad, el apoyo fue gracias a una base sólida y la implementación de una política fiscal enfocadas en las transparencias en uso de los recursos públicos, mientras que los autores,  </w:t>
-      </w:r>
-      <w:bookmarkStart w:id="29" w:name="_Hlk203775523"/>
-      <w:r>
-        <w:rPr>
-          <w:rFonts w:ascii="Times New Roman" w:hAnsi="Times New Roman" w:cs="Times New Roman"/>
-          <w:noProof/>
-        </w:rPr>
-        <w:t xml:space="preserve">Vargas </w:t>
-      </w:r>
-      <w:r>
-        <w:rPr>
-          <w:rFonts w:ascii="Times New Roman" w:hAnsi="Times New Roman" w:cs="Times New Roman"/>
-          <w:noProof/>
-        </w:rPr>
-        <w:t>y otros</w:t>
-      </w:r>
-      <w:r>
-        <w:rPr>
-          <w:rFonts w:ascii="Times New Roman" w:hAnsi="Times New Roman" w:cs="Times New Roman"/>
-          <w:noProof/>
-        </w:rPr>
-        <w:t xml:space="preserve">  (2022) </w:t>
-      </w:r>
-      <w:bookmarkEnd w:id="29"/>
-      <w:r>
-        <w:rPr>
-          <w:rFonts w:ascii="Times New Roman" w:hAnsi="Times New Roman" w:cs="Times New Roman"/>
-          <w:noProof/>
-        </w:rPr>
-        <w:t>y  en su investigacion se analizo la eficiente ejecucion de sus programas presupuestales teniendo como prioridad el  analisis ecometrico y regresion lineal multiple, ya que fueron seleccionados en su mayor incidencia en los gobiernos locales, resaltando el el rol presupuestal, siendo esto el rol mas activo, por otro lado la investiagacion de los autores, Vargas</w:t>
-      </w:r>
-      <w:r>
-        <w:rPr>
-          <w:rFonts w:ascii="Times New Roman" w:hAnsi="Times New Roman" w:cs="Times New Roman"/>
-          <w:noProof/>
-        </w:rPr>
-        <w:t xml:space="preserve"> y otros </w:t>
-      </w:r>
-      <w:r>
-        <w:rPr>
-          <w:rFonts w:ascii="Times New Roman" w:hAnsi="Times New Roman" w:cs="Times New Roman"/>
-          <w:noProof/>
-        </w:rPr>
-        <w:t>(2022), regulan los impuestos predial caracterizado por una debilidad institucional recpecto al derecho de la propiedad y un gran aumento de despojo y violencia de las propiedades, lo causo un progresivo reaudo del impuesto, por este sentido se permitio buscar de bienes y servicios de manera privada.</w:t>
-      </w:r>
-    </w:p>
-    <w:p>
-      <w:pPr>
-        <w:rPr>
-          <w:rFonts w:ascii="Times New Roman" w:hAnsi="Times New Roman" w:cs="Times New Roman"/>
-          <w:noProof/>
-          <w:lang w:val="es-ES"/>
-        </w:rPr>
-      </w:pPr>
-      <w:r>
-        <w:rPr>
-          <w:rFonts w:ascii="Times New Roman" w:hAnsi="Times New Roman" w:cs="Times New Roman"/>
-        </w:rPr>
-        <w:t xml:space="preserve">Y por último el cuarto objetivo específico, se determinó que el nivel de percepción de la dimensión determinación tributaria se sitúa en un nivel alto con 40%, porcentaje que se relaciona de manera directa con el resultado de percepción de la variable presupuesto,  la misma que también se sitúa en el  nivel medio con un 30%, de esta manera se demuestra una correlación directa media entra la dimensión y la variable mencionada, ya que a mayor nivel de percepción en una también se evidencia mayor nivel de percepción que en la otra. Por otro lado, se determinó unca correlación “Rho” de Spearman igual a 0.524(r=0524), con una orientación positiva entre la dimensión valoración de determinación tributaria y la </w:t>
-      </w:r>
-      <w:proofErr w:type="gramStart"/>
-      <w:r>
-        <w:rPr>
-          <w:rFonts w:ascii="Times New Roman" w:hAnsi="Times New Roman" w:cs="Times New Roman"/>
-        </w:rPr>
-        <w:t>variable presupuesto</w:t>
-      </w:r>
-      <w:proofErr w:type="gramEnd"/>
-      <w:r>
-        <w:rPr>
-          <w:rFonts w:ascii="Times New Roman" w:hAnsi="Times New Roman" w:cs="Times New Roman"/>
-        </w:rPr>
         <w:t xml:space="preserve">. Además, se obtuvo el p-valor “sig. Bilateral” p=0.003(p&lt;0.05), lo que conlleva aceptar Ha, demostrando la existencia de una relación media entre la dimensión y la variable presupuesto. mientras que, </w:t>
       </w:r>
       <w:bookmarkStart w:id="30" w:name="_Hlk203775558"/>
@@ -12934,35 +13099,8 @@
           <w:noProof/>
           <w:lang w:val="es-ES"/>
         </w:rPr>
-        <w:t xml:space="preserve">sus resultados muestran  estudios realizados tranferencias federales en las finanzas publicas con respecto a las recaudaciones municipales de los  impuestos prediales, a diferencia de autores Molina  y otros (2018), su investigacion parte a las incidencias contables en el sector la municipalidad de lujan que le permite indetificar fortalezas y sus debilidades a travez de sus resultados, evidenciando debilidades en cuanto </w:t>
-      </w:r>
-      <w:r>
-        <w:rPr>
-          <w:rFonts w:ascii="Times New Roman" w:hAnsi="Times New Roman" w:cs="Times New Roman"/>
-          <w:noProof/>
-          <w:lang w:val="es-ES"/>
-        </w:rPr>
-        <w:lastRenderedPageBreak/>
-        <w:t xml:space="preserve">a la falta de profundidad de la necesidades y problematicas que fueron desarrolldas, de igula forma los autores, Quispe y otros (2020)  sus necesidades primordiales urgen a obligar a las autoridades a travez de su planificacion y finaciamiento el desarrollo de herramientas importantes en el catastro, ya que gracias a ello se recolecta una base de datos importante para la recaudacion de de los impuestos prediales. </w:t>
-      </w:r>
-    </w:p>
-    <w:p>
-      <w:pPr>
-        <w:rPr>
-          <w:rFonts w:ascii="Times New Roman" w:hAnsi="Times New Roman" w:cs="Times New Roman"/>
-          <w:noProof/>
-          <w:lang w:val="es-ES"/>
-        </w:rPr>
-      </w:pPr>
-    </w:p>
-    <w:p>
-      <w:pPr>
-        <w:rPr>
-          <w:rFonts w:ascii="Times New Roman" w:hAnsi="Times New Roman" w:cs="Times New Roman"/>
-          <w:noProof/>
-          <w:lang w:val="es-ES"/>
-        </w:rPr>
-      </w:pPr>
+        <w:t xml:space="preserve">sus resultados muestran  estudios realizados tranferencias federales en las finanzas publicas con respecto a las recaudaciones municipales de los  impuestos prediales, a diferencia de autores Molina  y otros (2018), su investigacion parte a las incidencias contables en el sector la municipalidad de lujan que le permite indetificar fortalezas y sus debilidades a travez de sus resultados, evidenciando debilidades en cuanto a la falta de profundidad de la necesidades y problematicas que fueron desarrolldas, de igula forma los autores, Quispe y otros (2020)  sus necesidades primordiales urgen a obligar a las autoridades a travez de su planificacion y finaciamiento el desarrollo de herramientas importantes en el catastro, ya que gracias a ello se recolecta una base de datos importante para la recaudacion de de los impuestos prediales. </w:t>
+      </w:r>
     </w:p>
     <w:p>
       <w:pPr>
@@ -13027,7 +13165,14 @@
         <w:rPr>
           <w:rFonts w:ascii="Times New Roman" w:hAnsi="Times New Roman" w:cs="Times New Roman"/>
         </w:rPr>
-        <w:t xml:space="preserve">Así mismo, se puede confirmar que la hipótesis específica del cumplimiento tributario que se relaciona con el presupuesto, donde se obtuvo un 46,67% así como un 33.33% equivalente a 24 de 30 encuestados, teniendo una apreciación valorativa medio y alto afirmando que la recaudación y cultura tributaria en la mayoría de la valoración es alta permitiendo un desempeño satisfactorio de los recursos necesarios para la municipalidad distrital de Tacna. Estableciendo que existe relación con la dimensión cumplimiento tributario y la </w:t>
+        <w:t xml:space="preserve">Así mismo, se puede confirmar que la hipótesis específica del cumplimiento tributario que se relaciona con el presupuesto, donde se obtuvo un 46,67% así como un 33.33% equivalente a 24 de 30 encuestados, teniendo una apreciación valorativa medio y alto </w:t>
+      </w:r>
+      <w:r>
+        <w:rPr>
+          <w:rFonts w:ascii="Times New Roman" w:hAnsi="Times New Roman" w:cs="Times New Roman"/>
+        </w:rPr>
+        <w:lastRenderedPageBreak/>
+        <w:t xml:space="preserve">afirmando que la recaudación y cultura tributaria en la mayoría de la valoración es alta permitiendo un desempeño satisfactorio de los recursos necesarios para la municipalidad distrital de Tacna. Estableciendo que existe relación con la dimensión cumplimiento tributario y la </w:t>
       </w:r>
       <w:proofErr w:type="gramStart"/>
       <w:r>
@@ -13109,99 +13254,115 @@
         <w:rPr>
           <w:rFonts w:ascii="Times New Roman" w:hAnsi="Times New Roman" w:cs="Times New Roman"/>
         </w:rPr>
+        <w:t xml:space="preserve">Continuando con la hipótesis especifica de la valoración de bienes se relaciona con el presupuesto, donde se obtuvo un 50% así como un 30% equivalente al 24 de 30 encuestados, teniendo una </w:t>
+      </w:r>
+      <w:proofErr w:type="gramStart"/>
+      <w:r>
+        <w:rPr>
+          <w:rFonts w:ascii="Times New Roman" w:hAnsi="Times New Roman" w:cs="Times New Roman"/>
+        </w:rPr>
+        <w:t>apreciación  valorativa</w:t>
+      </w:r>
+      <w:proofErr w:type="gramEnd"/>
+      <w:r>
+        <w:rPr>
+          <w:rFonts w:ascii="Times New Roman" w:hAnsi="Times New Roman" w:cs="Times New Roman"/>
+        </w:rPr>
+        <w:t xml:space="preserve"> medio y alto afirmando que la eficiente contrataciones y recursos, en la mayoría tiene una valoración alta permitiendo un proceso estructurado el cual involucra acciones y decisiones dentro de la municipalidad de Tacna. Estableciendo que existe relación con la dimensión validación de bienes y la </w:t>
+      </w:r>
+      <w:proofErr w:type="gramStart"/>
+      <w:r>
+        <w:rPr>
+          <w:rFonts w:ascii="Times New Roman" w:hAnsi="Times New Roman" w:cs="Times New Roman"/>
+        </w:rPr>
+        <w:t>variable presupuesto</w:t>
+      </w:r>
+      <w:proofErr w:type="gramEnd"/>
+      <w:r>
+        <w:rPr>
+          <w:rFonts w:ascii="Times New Roman" w:hAnsi="Times New Roman" w:cs="Times New Roman"/>
+        </w:rPr>
+        <w:t xml:space="preserve"> en la municipalidad provincial de Tacna,2022. Ya que se </w:t>
+      </w:r>
+      <w:proofErr w:type="spellStart"/>
+      <w:r>
+        <w:rPr>
+          <w:rFonts w:ascii="Times New Roman" w:hAnsi="Times New Roman" w:cs="Times New Roman"/>
+        </w:rPr>
+        <w:t>logro</w:t>
+      </w:r>
+      <w:proofErr w:type="spellEnd"/>
+      <w:r>
+        <w:rPr>
+          <w:rFonts w:ascii="Times New Roman" w:hAnsi="Times New Roman" w:cs="Times New Roman"/>
+        </w:rPr>
+        <w:t xml:space="preserve"> un coeficiente de Rho Spearman de 0.505 y un valor de significancia de p=0.004, lo que indica que existe relación directa media.</w:t>
+      </w:r>
+    </w:p>
+    <w:p>
+      <w:pPr>
+        <w:rPr>
+          <w:rFonts w:ascii="Times New Roman" w:hAnsi="Times New Roman" w:cs="Times New Roman"/>
+        </w:rPr>
+      </w:pPr>
+      <w:r>
+        <w:rPr>
+          <w:rFonts w:ascii="Times New Roman" w:hAnsi="Times New Roman" w:cs="Times New Roman"/>
+        </w:rPr>
+        <w:t xml:space="preserve">Por último, la dimensión de determinación tributaria se relaciona con el presupuesto, donde se obtuvo un 40% así como un 36,7% equivalente al 23 de 30 encuestados, teniendo una apreciación valorativa medio y alto afirmando la base imponible y cobertura catastral, en la mayoría la valoración es alta permitiendo un proceso estructurado el cual involucra acciones y decisiones dentro de la municipalidad de Tacna.  se determinó que hay relación con la dimensión determinación tributaria y la </w:t>
+      </w:r>
+      <w:proofErr w:type="gramStart"/>
+      <w:r>
+        <w:rPr>
+          <w:rFonts w:ascii="Times New Roman" w:hAnsi="Times New Roman" w:cs="Times New Roman"/>
+        </w:rPr>
+        <w:t>variable presupuesto</w:t>
+      </w:r>
+      <w:proofErr w:type="gramEnd"/>
+      <w:r>
+        <w:rPr>
+          <w:rFonts w:ascii="Times New Roman" w:hAnsi="Times New Roman" w:cs="Times New Roman"/>
+        </w:rPr>
+        <w:t xml:space="preserve"> en la municipalidad provincial de Tacna,2022. Ya que se obtuvo 0.524 de coeficiente Rho Spearman, con p=0.003, lo cual nos indica que la relación directa media considerable.</w:t>
+      </w:r>
+    </w:p>
+    <w:p>
+      <w:pPr>
+        <w:rPr>
+          <w:rFonts w:ascii="Times New Roman" w:hAnsi="Times New Roman" w:cs="Times New Roman"/>
+          <w:lang w:val="es-ES"/>
+        </w:rPr>
+      </w:pPr>
+    </w:p>
+    <w:p>
+      <w:pPr>
+        <w:rPr>
+          <w:rFonts w:ascii="Times New Roman" w:hAnsi="Times New Roman" w:cs="Times New Roman"/>
+          <w:lang w:val="es-ES"/>
+        </w:rPr>
+      </w:pPr>
+    </w:p>
+    <w:p>
+      <w:pPr>
+        <w:rPr>
+          <w:rFonts w:ascii="Times New Roman" w:hAnsi="Times New Roman" w:cs="Times New Roman"/>
+          <w:lang w:val="es-ES"/>
+        </w:rPr>
+      </w:pPr>
+    </w:p>
+    <w:p>
+      <w:pPr>
+        <w:rPr>
+          <w:rFonts w:ascii="Times New Roman" w:hAnsi="Times New Roman" w:cs="Times New Roman"/>
+          <w:lang w:val="es-ES"/>
+        </w:rPr>
+      </w:pPr>
+      <w:r>
+        <w:rPr>
+          <w:rFonts w:ascii="Times New Roman" w:hAnsi="Times New Roman" w:cs="Times New Roman"/>
+          <w:lang w:val="es-ES"/>
+        </w:rPr>
         <w:lastRenderedPageBreak/>
-        <w:t xml:space="preserve">Continuando con la hipótesis especifica de la valoración de bienes se relaciona con el presupuesto, donde se obtuvo un 50% así como un 30% equivalente al 24 de 30 encuestados, teniendo una </w:t>
-      </w:r>
-      <w:proofErr w:type="gramStart"/>
-      <w:r>
-        <w:rPr>
-          <w:rFonts w:ascii="Times New Roman" w:hAnsi="Times New Roman" w:cs="Times New Roman"/>
-        </w:rPr>
-        <w:t>apreciación  valorativa</w:t>
-      </w:r>
-      <w:proofErr w:type="gramEnd"/>
-      <w:r>
-        <w:rPr>
-          <w:rFonts w:ascii="Times New Roman" w:hAnsi="Times New Roman" w:cs="Times New Roman"/>
-        </w:rPr>
-        <w:t xml:space="preserve"> medio y alto afirmando que la eficiente contrataciones y recursos, en la mayoría tiene una valoración alta permitiendo un proceso estructurado el cual involucra acciones y decisiones dentro de la municipalidad de Tacna. Estableciendo que existe relación con la dimensión validación de bienes y la </w:t>
-      </w:r>
-      <w:proofErr w:type="gramStart"/>
-      <w:r>
-        <w:rPr>
-          <w:rFonts w:ascii="Times New Roman" w:hAnsi="Times New Roman" w:cs="Times New Roman"/>
-        </w:rPr>
-        <w:t>variable presupuesto</w:t>
-      </w:r>
-      <w:proofErr w:type="gramEnd"/>
-      <w:r>
-        <w:rPr>
-          <w:rFonts w:ascii="Times New Roman" w:hAnsi="Times New Roman" w:cs="Times New Roman"/>
-        </w:rPr>
-        <w:t xml:space="preserve"> en la municipalidad provincial de Tacna,2022. Ya que se </w:t>
-      </w:r>
-      <w:proofErr w:type="spellStart"/>
-      <w:r>
-        <w:rPr>
-          <w:rFonts w:ascii="Times New Roman" w:hAnsi="Times New Roman" w:cs="Times New Roman"/>
-        </w:rPr>
-        <w:t>logro</w:t>
-      </w:r>
-      <w:proofErr w:type="spellEnd"/>
-      <w:r>
-        <w:rPr>
-          <w:rFonts w:ascii="Times New Roman" w:hAnsi="Times New Roman" w:cs="Times New Roman"/>
-        </w:rPr>
-        <w:t xml:space="preserve"> un coeficiente de Rho Spearman de 0.505 y un valor de significancia de p=0.004, lo que indica que existe relación directa media.</w:t>
-      </w:r>
-    </w:p>
-    <w:p>
-      <w:pPr>
-        <w:rPr>
-          <w:rFonts w:ascii="Times New Roman" w:hAnsi="Times New Roman" w:cs="Times New Roman"/>
-        </w:rPr>
-      </w:pPr>
-      <w:r>
-        <w:rPr>
-          <w:rFonts w:ascii="Times New Roman" w:hAnsi="Times New Roman" w:cs="Times New Roman"/>
-        </w:rPr>
-        <w:t xml:space="preserve">Por último, la dimensión de determinación tributaria se relaciona con el presupuesto, donde se obtuvo un 40% así como un 36,7% equivalente al 23 de 30 encuestados, teniendo una apreciación valorativa medio y alto afirmando la base imponible y cobertura catastral, en la mayoría la valoración es alta permitiendo un proceso estructurado el cual involucra acciones y decisiones dentro de la municipalidad de Tacna.  se determinó que hay relación con la dimensión determinación tributaria y la </w:t>
-      </w:r>
-      <w:proofErr w:type="gramStart"/>
-      <w:r>
-        <w:rPr>
-          <w:rFonts w:ascii="Times New Roman" w:hAnsi="Times New Roman" w:cs="Times New Roman"/>
-        </w:rPr>
-        <w:t>variable presupuesto</w:t>
-      </w:r>
-      <w:proofErr w:type="gramEnd"/>
-      <w:r>
-        <w:rPr>
-          <w:rFonts w:ascii="Times New Roman" w:hAnsi="Times New Roman" w:cs="Times New Roman"/>
-        </w:rPr>
-        <w:t xml:space="preserve"> en la municipalidad provincial de Tacna,2022. Ya que se obtuvo 0.524 de coeficiente Rho Spearman, con p=0.003, lo cual nos indica que la relación directa media considerable.</w:t>
-      </w:r>
-    </w:p>
-    <w:p>
-      <w:pPr>
-        <w:rPr>
-          <w:rFonts w:ascii="Times New Roman" w:hAnsi="Times New Roman" w:cs="Times New Roman"/>
-          <w:lang w:val="es-ES"/>
-        </w:rPr>
-      </w:pPr>
-    </w:p>
-    <w:p>
-      <w:pPr>
-        <w:rPr>
-          <w:rFonts w:ascii="Times New Roman" w:hAnsi="Times New Roman" w:cs="Times New Roman"/>
-          <w:lang w:val="es-ES"/>
-        </w:rPr>
-      </w:pPr>
-      <w:r>
-        <w:rPr>
-          <w:rFonts w:ascii="Times New Roman" w:hAnsi="Times New Roman" w:cs="Times New Roman"/>
-          <w:lang w:val="es-ES"/>
-        </w:rPr>
         <w:t xml:space="preserve">REFERENCIAS </w:t>
       </w:r>
     </w:p>
@@ -13383,7 +13544,6 @@
           <w:noProof/>
           <w:lang w:val="es-ES"/>
         </w:rPr>
-        <w:lastRenderedPageBreak/>
         <w:t xml:space="preserve">5. Martínez Sánchez, J. F., &amp; Cano Moreno, A. (2023). La relación entre impuesto predial y capacidades institucionales municipales: el caso de Hidalgo, Mexico. </w:t>
       </w:r>
       <w:r>
@@ -13556,6 +13716,7 @@
           <w:noProof/>
           <w:lang w:val="es-ES"/>
         </w:rPr>
+        <w:lastRenderedPageBreak/>
         <w:t xml:space="preserve">9. Rituay Martinez, R. V., &amp; Baylon Salvado, E. G. (17 de 07 de 2024). La cultura tributaria en la recepción del impuesto predial y arbitrios municipales en. </w:t>
       </w:r>
       <w:r>
@@ -13755,16 +13916,7 @@
           <w:noProof/>
           <w:lang w:val="es-ES"/>
         </w:rPr>
-        <w:t xml:space="preserve">14. Vargas Reina, J., García Reyes, P., &amp; Gutiérrez Sanín, F. (2022). Problemas del cobro del impuesto predial y sus efectos sociales en contextos de conflicto armado. Los casos </w:t>
-      </w:r>
-      <w:r>
-        <w:rPr>
-          <w:rFonts w:ascii="Times New Roman" w:hAnsi="Times New Roman" w:cs="Times New Roman"/>
-          <w:noProof/>
-          <w:lang w:val="es-ES"/>
-        </w:rPr>
-        <w:lastRenderedPageBreak/>
-        <w:t xml:space="preserve">de Carmen de Bolívar y Turbo en Colombia. </w:t>
+        <w:t xml:space="preserve">14. Vargas Reina, J., García Reyes, P., &amp; Gutiérrez Sanín, F. (2022). Problemas del cobro del impuesto predial y sus efectos sociales en contextos de conflicto armado. Los casos de Carmen de Bolívar y Turbo en Colombia. </w:t>
       </w:r>
       <w:r>
         <w:rPr>

</xml_diff>